<commit_message>
WO-REF01-060-B16-P01-TRANSFER-FIX-002: P-01 전달 확인 입력란 신설
전달 대상(업체/담당자)·전달 일시·전달 확인자·서명 labeled_grid 추가.
repeat_table 8→7행(페이지 유지). 교정 전 2건 격리. 385/385 PASS. DB=0.

WO: WO-REF01-060-B16-P01-TRANSFER-FIX-002
BASE: cff58165295ea5bbf73bafc1bc0781a698dac57e
JSON_CORRECTED: 1 (P-01)
PDF_REBUILT: 1
DOCX_REBUILT: 1
ARCHIVED: 2
OTHER_OUTPUT_SHA: UNCHANGED 290/290
PYTEST: 385/385 PASS
DB: 0
</commit_message>
<xml_diff>
--- a/docs/reference-forms/output/TAI-FORM-P-01-blank.docx
+++ b/docs/reference-forms/output/TAI-FORM-P-01-blank.docx
@@ -2426,267 +2426,6 @@
           </w:p>
         </w:tc>
       </w:tr>
-      <w:tr>
-        <w:trPr>
-          <w:trHeight w:val="510" w:hRule="atLeast"/>
-        </w:trPr>
-        <w:tc>
-          <w:tcPr>
-            <w:tcW w:type="dxa" w:w="566"/>
-            <w:tcBorders>
-              <w:top w:val="single" w:color="000000" w:sz="4"/>
-              <w:left w:val="single" w:color="000000" w:sz="4"/>
-              <w:bottom w:val="single" w:color="000000" w:sz="4"/>
-              <w:right w:val="single" w:color="000000" w:sz="4"/>
-            </w:tcBorders>
-            <w:shd w:fill="F5F5F5" w:color="auto" w:val="clear"/>
-            <w:tcMar>
-              <w:top w:type="dxa" w:w="170"/>
-              <w:left w:type="dxa" w:w="170"/>
-              <w:bottom w:type="dxa" w:w="170"/>
-              <w:right w:type="dxa" w:w="170"/>
-            </w:tcMar>
-            <w:vAlign w:val="center"/>
-          </w:tcPr>
-          <w:p>
-            <w:pPr>
-              <w:jc w:val="left"/>
-            </w:pPr>
-            <w:r>
-              <w:rPr>
-                <w:rFonts w:ascii="NanumGothic" w:cs="NanumGothic" w:eastAsia="NanumGothic" w:hAnsi="NanumGothic"/>
-                <w:sz w:val="20"/>
-                <w:szCs w:val="20"/>
-              </w:rPr>
-              <w:t xml:space="preserve"/>
-            </w:r>
-          </w:p>
-        </w:tc>
-        <w:tc>
-          <w:tcPr>
-            <w:tcW w:type="dxa" w:w="1133"/>
-            <w:tcBorders>
-              <w:top w:val="single" w:color="000000" w:sz="4"/>
-              <w:left w:val="single" w:color="000000" w:sz="4"/>
-              <w:bottom w:val="single" w:color="000000" w:sz="4"/>
-              <w:right w:val="single" w:color="000000" w:sz="4"/>
-            </w:tcBorders>
-            <w:shd w:fill="F5F5F5" w:color="auto" w:val="clear"/>
-            <w:tcMar>
-              <w:top w:type="dxa" w:w="170"/>
-              <w:left w:type="dxa" w:w="170"/>
-              <w:bottom w:type="dxa" w:w="170"/>
-              <w:right w:type="dxa" w:w="170"/>
-            </w:tcMar>
-            <w:vAlign w:val="center"/>
-          </w:tcPr>
-          <w:p>
-            <w:pPr>
-              <w:jc w:val="left"/>
-            </w:pPr>
-            <w:r>
-              <w:rPr>
-                <w:rFonts w:ascii="NanumGothic" w:cs="NanumGothic" w:eastAsia="NanumGothic" w:hAnsi="NanumGothic"/>
-                <w:sz w:val="20"/>
-                <w:szCs w:val="20"/>
-              </w:rPr>
-              <w:t xml:space="preserve"/>
-            </w:r>
-          </w:p>
-        </w:tc>
-        <w:tc>
-          <w:tcPr>
-            <w:tcW w:type="dxa" w:w="1587"/>
-            <w:tcBorders>
-              <w:top w:val="single" w:color="000000" w:sz="4"/>
-              <w:left w:val="single" w:color="000000" w:sz="4"/>
-              <w:bottom w:val="single" w:color="000000" w:sz="4"/>
-              <w:right w:val="single" w:color="000000" w:sz="4"/>
-            </w:tcBorders>
-            <w:shd w:fill="F5F5F5" w:color="auto" w:val="clear"/>
-            <w:tcMar>
-              <w:top w:type="dxa" w:w="170"/>
-              <w:left w:type="dxa" w:w="170"/>
-              <w:bottom w:type="dxa" w:w="170"/>
-              <w:right w:type="dxa" w:w="170"/>
-            </w:tcMar>
-            <w:vAlign w:val="center"/>
-          </w:tcPr>
-          <w:p>
-            <w:pPr>
-              <w:jc w:val="left"/>
-            </w:pPr>
-            <w:r>
-              <w:rPr>
-                <w:rFonts w:ascii="NanumGothic" w:cs="NanumGothic" w:eastAsia="NanumGothic" w:hAnsi="NanumGothic"/>
-                <w:sz w:val="20"/>
-                <w:szCs w:val="20"/>
-              </w:rPr>
-              <w:t xml:space="preserve"/>
-            </w:r>
-          </w:p>
-        </w:tc>
-        <w:tc>
-          <w:tcPr>
-            <w:tcW w:type="dxa" w:w="1700"/>
-            <w:tcBorders>
-              <w:top w:val="single" w:color="000000" w:sz="4"/>
-              <w:left w:val="single" w:color="000000" w:sz="4"/>
-              <w:bottom w:val="single" w:color="000000" w:sz="4"/>
-              <w:right w:val="single" w:color="000000" w:sz="4"/>
-            </w:tcBorders>
-            <w:shd w:fill="F5F5F5" w:color="auto" w:val="clear"/>
-            <w:tcMar>
-              <w:top w:type="dxa" w:w="170"/>
-              <w:left w:type="dxa" w:w="170"/>
-              <w:bottom w:type="dxa" w:w="170"/>
-              <w:right w:type="dxa" w:w="170"/>
-            </w:tcMar>
-            <w:vAlign w:val="center"/>
-          </w:tcPr>
-          <w:p>
-            <w:pPr>
-              <w:jc w:val="left"/>
-            </w:pPr>
-            <w:r>
-              <w:rPr>
-                <w:rFonts w:ascii="NanumGothic" w:cs="NanumGothic" w:eastAsia="NanumGothic" w:hAnsi="NanumGothic"/>
-                <w:sz w:val="20"/>
-                <w:szCs w:val="20"/>
-              </w:rPr>
-              <w:t xml:space="preserve"/>
-            </w:r>
-          </w:p>
-        </w:tc>
-        <w:tc>
-          <w:tcPr>
-            <w:tcW w:type="dxa" w:w="907"/>
-            <w:tcBorders>
-              <w:top w:val="single" w:color="000000" w:sz="4"/>
-              <w:left w:val="single" w:color="000000" w:sz="4"/>
-              <w:bottom w:val="single" w:color="000000" w:sz="4"/>
-              <w:right w:val="single" w:color="000000" w:sz="4"/>
-            </w:tcBorders>
-            <w:shd w:fill="F5F5F5" w:color="auto" w:val="clear"/>
-            <w:tcMar>
-              <w:top w:type="dxa" w:w="170"/>
-              <w:left w:type="dxa" w:w="170"/>
-              <w:bottom w:type="dxa" w:w="170"/>
-              <w:right w:type="dxa" w:w="170"/>
-            </w:tcMar>
-            <w:vAlign w:val="center"/>
-          </w:tcPr>
-          <w:p>
-            <w:pPr>
-              <w:jc w:val="left"/>
-            </w:pPr>
-            <w:r>
-              <w:rPr>
-                <w:rFonts w:ascii="NanumGothic" w:cs="NanumGothic" w:eastAsia="NanumGothic" w:hAnsi="NanumGothic"/>
-                <w:sz w:val="20"/>
-                <w:szCs w:val="20"/>
-              </w:rPr>
-              <w:t xml:space="preserve"/>
-            </w:r>
-          </w:p>
-        </w:tc>
-        <w:tc>
-          <w:tcPr>
-            <w:tcW w:type="dxa" w:w="793"/>
-            <w:tcBorders>
-              <w:top w:val="single" w:color="000000" w:sz="4"/>
-              <w:left w:val="single" w:color="000000" w:sz="4"/>
-              <w:bottom w:val="single" w:color="000000" w:sz="4"/>
-              <w:right w:val="single" w:color="000000" w:sz="4"/>
-            </w:tcBorders>
-            <w:shd w:fill="F5F5F5" w:color="auto" w:val="clear"/>
-            <w:tcMar>
-              <w:top w:type="dxa" w:w="170"/>
-              <w:left w:type="dxa" w:w="170"/>
-              <w:bottom w:type="dxa" w:w="170"/>
-              <w:right w:type="dxa" w:w="170"/>
-            </w:tcMar>
-            <w:vAlign w:val="center"/>
-          </w:tcPr>
-          <w:p>
-            <w:pPr>
-              <w:jc w:val="left"/>
-            </w:pPr>
-            <w:r>
-              <w:rPr>
-                <w:rFonts w:ascii="NanumGothic" w:cs="NanumGothic" w:eastAsia="NanumGothic" w:hAnsi="NanumGothic"/>
-                <w:sz w:val="20"/>
-                <w:szCs w:val="20"/>
-              </w:rPr>
-              <w:t xml:space="preserve"/>
-            </w:r>
-          </w:p>
-        </w:tc>
-        <w:tc>
-          <w:tcPr>
-            <w:tcW w:type="dxa" w:w="1360"/>
-            <w:tcBorders>
-              <w:top w:val="single" w:color="000000" w:sz="4"/>
-              <w:left w:val="single" w:color="000000" w:sz="4"/>
-              <w:bottom w:val="single" w:color="000000" w:sz="4"/>
-              <w:right w:val="single" w:color="000000" w:sz="4"/>
-            </w:tcBorders>
-            <w:shd w:fill="F5F5F5" w:color="auto" w:val="clear"/>
-            <w:tcMar>
-              <w:top w:type="dxa" w:w="170"/>
-              <w:left w:type="dxa" w:w="170"/>
-              <w:bottom w:type="dxa" w:w="170"/>
-              <w:right w:type="dxa" w:w="170"/>
-            </w:tcMar>
-            <w:vAlign w:val="center"/>
-          </w:tcPr>
-          <w:p>
-            <w:pPr>
-              <w:jc w:val="left"/>
-            </w:pPr>
-            <w:r>
-              <w:rPr>
-                <w:rFonts w:ascii="NanumGothic" w:cs="NanumGothic" w:eastAsia="NanumGothic" w:hAnsi="NanumGothic"/>
-                <w:sz w:val="20"/>
-                <w:szCs w:val="20"/>
-              </w:rPr>
-              <w:t xml:space="preserve"/>
-            </w:r>
-          </w:p>
-        </w:tc>
-        <w:tc>
-          <w:tcPr>
-            <w:tcW w:type="dxa" w:w="1587"/>
-            <w:tcBorders>
-              <w:top w:val="single" w:color="000000" w:sz="4"/>
-              <w:left w:val="single" w:color="000000" w:sz="4"/>
-              <w:bottom w:val="single" w:color="000000" w:sz="4"/>
-              <w:right w:val="single" w:color="000000" w:sz="4"/>
-            </w:tcBorders>
-            <w:shd w:fill="F5F5F5" w:color="auto" w:val="clear"/>
-            <w:tcMar>
-              <w:top w:type="dxa" w:w="170"/>
-              <w:left w:type="dxa" w:w="170"/>
-              <w:bottom w:type="dxa" w:w="170"/>
-              <w:right w:type="dxa" w:w="170"/>
-            </w:tcMar>
-            <w:vAlign w:val="center"/>
-          </w:tcPr>
-          <w:p>
-            <w:pPr>
-              <w:jc w:val="left"/>
-            </w:pPr>
-            <w:r>
-              <w:rPr>
-                <w:rFonts w:ascii="NanumGothic" w:cs="NanumGothic" w:eastAsia="NanumGothic" w:hAnsi="NanumGothic"/>
-                <w:sz w:val="20"/>
-                <w:szCs w:val="20"/>
-              </w:rPr>
-              <w:t xml:space="preserve"/>
-            </w:r>
-          </w:p>
-        </w:tc>
-      </w:tr>
     </w:tbl>
     <w:p>
       <w:pPr>
@@ -2775,6 +2514,206 @@
           <w:p>
             <w:r>
               <w:t xml:space="preserve"/>
+            </w:r>
+          </w:p>
+        </w:tc>
+      </w:tr>
+    </w:tbl>
+    <w:p>
+      <w:pPr>
+        <w:spacing w:after="80" w:before="80"/>
+      </w:pPr>
+      <w:r>
+        <w:t xml:space="preserve"/>
+      </w:r>
+    </w:p>
+    <w:tbl>
+      <w:tblPr>
+        <w:tblW w:type="dxa" w:w="9637"/>
+        <w:tblBorders>
+          <w:top w:val="single" w:color="auto" w:sz="4"/>
+          <w:left w:val="single" w:color="auto" w:sz="4"/>
+          <w:bottom w:val="single" w:color="auto" w:sz="4"/>
+          <w:right w:val="single" w:color="auto" w:sz="4"/>
+          <w:insideH w:val="single" w:color="auto" w:sz="4"/>
+          <w:insideV w:val="single" w:color="auto" w:sz="4"/>
+        </w:tblBorders>
+        <w:tblLayout w:type="fixed"/>
+      </w:tblPr>
+      <w:tblGrid>
+        <w:gridCol w:w="4819"/>
+        <w:gridCol w:w="4819"/>
+      </w:tblGrid>
+      <w:tr>
+        <w:trPr>
+          <w:trHeight w:val="396" w:hRule="atLeast"/>
+        </w:trPr>
+        <w:tc>
+          <w:tcPr>
+            <w:tcW w:type="dxa" w:w="9637"/>
+            <w:gridSpan w:val="2"/>
+            <w:tcBorders>
+              <w:top w:val="single" w:color="000000" w:sz="4"/>
+              <w:left w:val="single" w:color="000000" w:sz="4"/>
+              <w:bottom w:val="single" w:color="000000" w:sz="4"/>
+              <w:right w:val="single" w:color="000000" w:sz="4"/>
+            </w:tcBorders>
+            <w:shd w:fill="E8E8E8" w:color="auto" w:val="clear"/>
+            <w:tcMar>
+              <w:top w:type="dxa" w:w="170"/>
+              <w:left w:type="dxa" w:w="170"/>
+              <w:bottom w:type="dxa" w:w="170"/>
+              <w:right w:type="dxa" w:w="170"/>
+            </w:tcMar>
+            <w:vAlign w:val="center"/>
+          </w:tcPr>
+          <w:p>
+            <w:pPr>
+              <w:jc w:val="center"/>
+            </w:pPr>
+            <w:r>
+              <w:rPr>
+                <w:rFonts w:ascii="NanumGothic" w:cs="NanumGothic" w:eastAsia="NanumGothic" w:hAnsi="NanumGothic"/>
+                <w:b/>
+                <w:bCs/>
+                <w:sz w:val="20"/>
+                <w:szCs w:val="20"/>
+              </w:rPr>
+              <w:t xml:space="preserve">전달 확인</w:t>
+            </w:r>
+          </w:p>
+        </w:tc>
+      </w:tr>
+      <w:tr>
+        <w:trPr>
+          <w:trHeight w:val="453" w:hRule="atLeast"/>
+        </w:trPr>
+        <w:tc>
+          <w:tcPr>
+            <w:tcW w:type="dxa" w:w="4819"/>
+            <w:tcBorders>
+              <w:top w:val="single" w:color="000000" w:sz="4"/>
+              <w:left w:val="single" w:color="000000" w:sz="4"/>
+              <w:bottom w:val="single" w:color="000000" w:sz="4"/>
+              <w:right w:val="single" w:color="000000" w:sz="4"/>
+            </w:tcBorders>
+            <w:shd w:fill="F5F5F5" w:color="auto" w:val="clear"/>
+            <w:tcMar>
+              <w:top w:type="dxa" w:w="170"/>
+              <w:left w:type="dxa" w:w="170"/>
+              <w:bottom w:type="dxa" w:w="170"/>
+              <w:right w:type="dxa" w:w="170"/>
+            </w:tcMar>
+            <w:vAlign w:val="center"/>
+          </w:tcPr>
+          <w:p>
+            <w:r>
+              <w:rPr>
+                <w:rFonts w:ascii="NanumGothic" w:cs="NanumGothic" w:eastAsia="NanumGothic" w:hAnsi="NanumGothic"/>
+                <w:b/>
+                <w:bCs/>
+                <w:sz w:val="20"/>
+                <w:szCs w:val="20"/>
+              </w:rPr>
+              <w:t xml:space="preserve">전달 대상(업체/담당자): </w:t>
+            </w:r>
+          </w:p>
+        </w:tc>
+        <w:tc>
+          <w:tcPr>
+            <w:tcW w:type="dxa" w:w="4819"/>
+            <w:tcBorders>
+              <w:top w:val="single" w:color="000000" w:sz="4"/>
+              <w:left w:val="single" w:color="000000" w:sz="4"/>
+              <w:bottom w:val="single" w:color="000000" w:sz="4"/>
+              <w:right w:val="single" w:color="000000" w:sz="4"/>
+            </w:tcBorders>
+            <w:shd w:fill="F5F5F5" w:color="auto" w:val="clear"/>
+            <w:tcMar>
+              <w:top w:type="dxa" w:w="170"/>
+              <w:left w:type="dxa" w:w="170"/>
+              <w:bottom w:type="dxa" w:w="170"/>
+              <w:right w:type="dxa" w:w="170"/>
+            </w:tcMar>
+            <w:vAlign w:val="center"/>
+          </w:tcPr>
+          <w:p>
+            <w:r>
+              <w:rPr>
+                <w:rFonts w:ascii="NanumGothic" w:cs="NanumGothic" w:eastAsia="NanumGothic" w:hAnsi="NanumGothic"/>
+                <w:b/>
+                <w:bCs/>
+                <w:sz w:val="20"/>
+                <w:szCs w:val="20"/>
+              </w:rPr>
+              <w:t xml:space="preserve">전달 일시: </w:t>
+            </w:r>
+          </w:p>
+        </w:tc>
+      </w:tr>
+      <w:tr>
+        <w:trPr>
+          <w:trHeight w:val="453" w:hRule="atLeast"/>
+        </w:trPr>
+        <w:tc>
+          <w:tcPr>
+            <w:tcW w:type="dxa" w:w="4819"/>
+            <w:tcBorders>
+              <w:top w:val="single" w:color="000000" w:sz="4"/>
+              <w:left w:val="single" w:color="000000" w:sz="4"/>
+              <w:bottom w:val="single" w:color="000000" w:sz="4"/>
+              <w:right w:val="single" w:color="000000" w:sz="4"/>
+            </w:tcBorders>
+            <w:shd w:fill="F5F5F5" w:color="auto" w:val="clear"/>
+            <w:tcMar>
+              <w:top w:type="dxa" w:w="170"/>
+              <w:left w:type="dxa" w:w="170"/>
+              <w:bottom w:type="dxa" w:w="170"/>
+              <w:right w:type="dxa" w:w="170"/>
+            </w:tcMar>
+            <w:vAlign w:val="center"/>
+          </w:tcPr>
+          <w:p>
+            <w:r>
+              <w:rPr>
+                <w:rFonts w:ascii="NanumGothic" w:cs="NanumGothic" w:eastAsia="NanumGothic" w:hAnsi="NanumGothic"/>
+                <w:b/>
+                <w:bCs/>
+                <w:sz w:val="20"/>
+                <w:szCs w:val="20"/>
+              </w:rPr>
+              <w:t xml:space="preserve">전달 확인자: </w:t>
+            </w:r>
+          </w:p>
+        </w:tc>
+        <w:tc>
+          <w:tcPr>
+            <w:tcW w:type="dxa" w:w="4819"/>
+            <w:tcBorders>
+              <w:top w:val="single" w:color="000000" w:sz="4"/>
+              <w:left w:val="single" w:color="000000" w:sz="4"/>
+              <w:bottom w:val="single" w:color="000000" w:sz="4"/>
+              <w:right w:val="single" w:color="000000" w:sz="4"/>
+            </w:tcBorders>
+            <w:shd w:fill="F5F5F5" w:color="auto" w:val="clear"/>
+            <w:tcMar>
+              <w:top w:type="dxa" w:w="170"/>
+              <w:left w:type="dxa" w:w="170"/>
+              <w:bottom w:type="dxa" w:w="170"/>
+              <w:right w:type="dxa" w:w="170"/>
+            </w:tcMar>
+            <w:vAlign w:val="center"/>
+          </w:tcPr>
+          <w:p>
+            <w:r>
+              <w:rPr>
+                <w:rFonts w:ascii="NanumGothic" w:cs="NanumGothic" w:eastAsia="NanumGothic" w:hAnsi="NanumGothic"/>
+                <w:b/>
+                <w:bCs/>
+                <w:sz w:val="20"/>
+                <w:szCs w:val="20"/>
+              </w:rPr>
+              <w:t xml:space="preserve">서명: </w:t>
             </w:r>
           </w:p>
         </w:tc>

</xml_diff>